<commit_message>
daylis 10 sprint 1
</commit_message>
<xml_diff>
--- a/Fase dos/Documentacion Scrum/Dailys/Dailys 9 - Sprint 1.docx
+++ b/Fase dos/Documentacion Scrum/Dailys/Dailys 9 - Sprint 1.docx
@@ -111,13 +111,8 @@
           <w:numId w:val="8"/>
         </w:numPr>
       </w:pPr>
-      <w:proofErr w:type="spellStart"/>
       <w:r>
-        <w:t>Dailys</w:t>
-      </w:r>
-      <w:proofErr w:type="spellEnd"/>
-      <w:r>
-        <w:t xml:space="preserve"> </w:t>
+        <w:t xml:space="preserve">Dailys </w:t>
       </w:r>
       <w:r>
         <w:t>9</w:t>
@@ -159,15 +154,7 @@
         <w:t>Israel Muñoz</w:t>
       </w:r>
       <w:r>
-        <w:t xml:space="preserve"> (</w:t>
-      </w:r>
-      <w:proofErr w:type="spellStart"/>
-      <w:r>
-        <w:t>Product</w:t>
-      </w:r>
-      <w:proofErr w:type="spellEnd"/>
-      <w:r>
-        <w:t xml:space="preserve"> Owner / desarrollador)</w:t>
+        <w:t xml:space="preserve"> (Product Owner / desarrollador)</w:t>
       </w:r>
     </w:p>
     <w:p>

</xml_diff>